<commit_message>
fix: reduce excessive space-padding causing Engagement Letter name wrap
Re-diagnosed the signature-block overlap: not the floating "Sign/签字"
textbox's position (absolutely positioned, unrelated to the wrap) --
the Name:/Designation:/Dated: lines are each padded with 82 literal
space characters instead of a tab/indent to align under the signature
line, and that alone eats enough width that a longer name has nowhere
to fit on one line. Reduced to 41 spaces (all 3 occurrences).

Unverified visually -- no way to render Word here. Generated a sample
doc with a ZHANG WEIZENG fixture to Vincent's Desktop for him to check.

Co-Authored-By: Claude Sonnet 5 <noreply@anthropic.com>
</commit_message>
<xml_diff>
--- a/templates/post-incorporate/05 Engagement_Letter_and_Indemnity_and_Undertaking_of_Secretarial_Services - template.docx
+++ b/templates/post-incorporate/05 Engagement_Letter_and_Indemnity_and_Undertaking_of_Secretarial_Services - template.docx
@@ -4357,7 +4357,7 @@
         </w:rPr>
       </w:pPr>
       <w:r>
-        <w:t xml:space="preserve">                                                                                  </w:t>
+        <w:t xml:space="preserve">                                         </w:t>
       </w:r>
       <w:r>
         <w:t xml:space="preserve">Name: </w:t>
@@ -4374,7 +4374,7 @@
         <w:spacing w:line="288" w:lineRule="auto"/>
       </w:pPr>
       <w:r>
-        <w:t xml:space="preserve">                                                                                  </w:t>
+        <w:t xml:space="preserve">                                         </w:t>
       </w:r>
       <w:r>
         <w:t>Designation: DIRECTOR</w:t>
@@ -4393,7 +4393,7 @@
         </w:sectPr>
       </w:pPr>
       <w:r>
-        <w:t xml:space="preserve">                                                                                  </w:t>
+        <w:t xml:space="preserve">                                         </w:t>
       </w:r>
       <w:r>
         <w:t xml:space="preserve">Dated: </w:t>

</xml_diff>